<commit_message>
interim report 1st draft
</commit_message>
<xml_diff>
--- a/Progress.docx
+++ b/Progress.docx
@@ -25,13 +25,14 @@
           </w:tcPr>
           <w:p>
             <w:r>
-              <w:t xml:space="preserve">Research </w:t>
-            </w:r>
-            <w:proofErr w:type="spellStart"/>
-            <w:r>
-              <w:t>Quesiton</w:t>
-            </w:r>
-            <w:proofErr w:type="spellEnd"/>
+              <w:t>Research Quest</w:t>
+            </w:r>
+            <w:r>
+              <w:t>i</w:t>
+            </w:r>
+            <w:r>
+              <w:t>on</w:t>
+            </w:r>
           </w:p>
         </w:tc>
         <w:tc>
@@ -58,13 +59,7 @@
               <w:jc w:val="both"/>
             </w:pPr>
             <w:r>
-              <w:t xml:space="preserve">How does agile software development affect project success </w:t>
-            </w:r>
-            <w:r>
-              <w:t>compare</w:t>
-            </w:r>
-            <w:r>
-              <w:t xml:space="preserve"> to the waterfall model?</w:t>
+              <w:t>How does agile software development affect project success compare to the waterfall model?</w:t>
             </w:r>
           </w:p>
           <w:tbl>
@@ -653,7 +648,15 @@
               <w:jc w:val="both"/>
             </w:pPr>
             <w:r>
-              <w:t xml:space="preserve">    "project success" OR "project performance" OR "project outcome" </w:t>
+              <w:t xml:space="preserve">    "</w:t>
+            </w:r>
+            <w:proofErr w:type="gramStart"/>
+            <w:r>
+              <w:t>project</w:t>
+            </w:r>
+            <w:proofErr w:type="gramEnd"/>
+            <w:r>
+              <w:t xml:space="preserve"> success" OR "project performance" OR "project outcome" </w:t>
             </w:r>
           </w:p>
           <w:p>
@@ -717,7 +720,15 @@
               <w:jc w:val="both"/>
             </w:pPr>
             <w:r>
-              <w:t xml:space="preserve">    "software engineering" OR "software development" </w:t>
+              <w:t xml:space="preserve">    "</w:t>
+            </w:r>
+            <w:proofErr w:type="gramStart"/>
+            <w:r>
+              <w:t>software</w:t>
+            </w:r>
+            <w:proofErr w:type="gramEnd"/>
+            <w:r>
+              <w:t xml:space="preserve"> engineering" OR "software development" </w:t>
             </w:r>
           </w:p>
           <w:p>
@@ -1488,6 +1499,7 @@
   <w:style w:type="character" w:default="1" w:styleId="DefaultParagraphFont">
     <w:name w:val="Default Paragraph Font"/>
     <w:uiPriority w:val="1"/>
+    <w:semiHidden/>
     <w:unhideWhenUsed/>
   </w:style>
   <w:style w:type="table" w:default="1" w:styleId="TableNormal">

</xml_diff>